<commit_message>
Add/update resource data for UWTranslationWords
</commit_message>
<xml_diff>
--- a/arb/docx/001.content.docx
+++ b/arb/docx/001.content.docx
@@ -137,21 +137,6 @@
           <w:lang w:val="ar_AE" w:bidi="ar_AE"/>
         </w:rPr>
         <w:t>س</w:t>
-      </w:r>
-      <w:r>
-        <w:rPr>
-          <w:lang w:val="ar_AE" w:bidi="ar_AE"/>
-        </w:rPr>
-      </w:r>
-    </w:p>
-    <w:p>
-      <w:pPr>
-        <w:bidi/>
-      </w:pPr>
-      <w:r>
-        <w:rPr>
-          <w:lang w:val="ar_AE" w:bidi="ar_AE"/>
-        </w:rPr>
       </w:r>
       <w:r>
         <w:rPr>

</xml_diff>